<commit_message>
Update submission docs for welcome page, local deployment, and current UI screenshots.
Refresh README, architecture notes, environment setup, sample outputs, and regenerated Word copies for IIT Patna evaluators.

Co-authored-by: Cursor <cursoragent@cursor.com>
</commit_message>
<xml_diff>
--- a/SubmissionDocument/ARCHITECTURE.docx
+++ b/SubmissionDocument/ARCHITECTURE.docx
@@ -119,11 +119,92 @@
         <w:br/>
         <w:t xml:space="preserve">          ┌───────────────────────┐</w:t>
         <w:br/>
-        <w:t xml:space="preserve">          │   Streamlit Chat UI   │  app/ui/chat.py</w:t>
+        <w:t xml:space="preserve">          │   Streamlit UI        │  app/main.py</w:t>
+        <w:br/>
+        <w:t xml:space="preserve">          │  Welcome → Chat       │  app/ui/welcome.py, app/ui/chat.py</w:t>
         <w:br/>
         <w:t xml:space="preserve">          │  Answer + Sources     │</w:t>
         <w:br/>
+        <w:t xml:space="preserve">          └──────────┬────────────┘</w:t>
+        <w:br/>
+        <w:t xml:space="preserve">                     │</w:t>
+        <w:br/>
+        <w:t xml:space="preserve">                     ▼</w:t>
+        <w:br/>
+        <w:t xml:space="preserve">          ┌───────────────────────┐</w:t>
+        <w:br/>
+        <w:t xml:space="preserve">          │   Session Logger      │  util/logger.py</w:t>
+        <w:br/>
+        <w:t xml:space="preserve">          │  (cross-cutting)      │  → logs/ (per app run)</w:t>
+        <w:br/>
         <w:t xml:space="preserve">          └───────────────────────┘</w:t>
+      </w:r>
+    </w:p>
+    <w:p>
+      <w:r>
+        <w:rPr>
+          <w:b/>
+        </w:rPr>
+        <w:t>Logger scope:</w:t>
+      </w:r>
+      <w:r>
+        <w:t xml:space="preserve"> </w:t>
+      </w:r>
+      <w:r>
+        <w:rPr>
+          <w:rFonts w:ascii="Courier New" w:hAnsi="Courier New"/>
+          <w:sz w:val="18"/>
+        </w:rPr>
+        <w:t>util/logger.py</w:t>
+      </w:r>
+      <w:r>
+        <w:t xml:space="preserve"> is used across </w:t>
+      </w:r>
+      <w:r>
+        <w:rPr>
+          <w:b/>
+        </w:rPr>
+        <w:t>ingestion</w:t>
+      </w:r>
+      <w:r>
+        <w:t xml:space="preserve">, </w:t>
+      </w:r>
+      <w:r>
+        <w:rPr>
+          <w:b/>
+        </w:rPr>
+        <w:t>retrieval</w:t>
+      </w:r>
+      <w:r>
+        <w:t xml:space="preserve">, </w:t>
+      </w:r>
+      <w:r>
+        <w:rPr>
+          <w:b/>
+        </w:rPr>
+        <w:t>generation</w:t>
+      </w:r>
+      <w:r>
+        <w:t xml:space="preserve">, and the </w:t>
+      </w:r>
+      <w:r>
+        <w:rPr>
+          <w:b/>
+        </w:rPr>
+        <w:t>app</w:t>
+      </w:r>
+      <w:r>
+        <w:t xml:space="preserve"> to record pipeline steps, retrieved chunks, LLM prompts/responses, and errors in timestamped files under </w:t>
+      </w:r>
+      <w:r>
+        <w:rPr>
+          <w:rFonts w:ascii="Courier New" w:hAnsi="Courier New"/>
+          <w:sz w:val="18"/>
+        </w:rPr>
+        <w:t>logs/</w:t>
+      </w:r>
+      <w:r>
+        <w:t>.</w:t>
       </w:r>
     </w:p>
     <w:p/>
@@ -217,7 +298,7 @@
               <w:rPr>
                 <w:sz w:val="20"/>
               </w:rPr>
-              <w:t>Streamlit entry point</w:t>
+              <w:t>Streamlit entry point; welcome vs chat routing</w:t>
             </w:r>
           </w:p>
         </w:tc>
@@ -257,6 +338,45 @@
                 <w:sz w:val="20"/>
               </w:rPr>
               <w:t>Central configuration</w:t>
+            </w:r>
+          </w:p>
+        </w:tc>
+      </w:tr>
+      <w:tr>
+        <w:tc>
+          <w:tcPr>
+            <w:tcW w:type="dxa" w:w="4320"/>
+          </w:tcPr>
+          <w:p>
+            <w:r>
+              <w:rPr>
+                <w:sz w:val="20"/>
+              </w:rPr>
+            </w:r>
+            <w:r>
+              <w:rPr>
+                <w:rFonts w:ascii="Courier New" w:hAnsi="Courier New"/>
+                <w:sz w:val="20"/>
+              </w:rPr>
+              <w:t>app/ui/welcome.py</w:t>
+            </w:r>
+          </w:p>
+        </w:tc>
+        <w:tc>
+          <w:tcPr>
+            <w:tcW w:type="dxa" w:w="4320"/>
+          </w:tcPr>
+          <w:p>
+            <w:r>
+              <w:rPr>
+                <w:sz w:val="20"/>
+              </w:rPr>
+            </w:r>
+            <w:r>
+              <w:rPr>
+                <w:sz w:val="20"/>
+              </w:rPr>
+              <w:t>Landing page with project overview and Start Conversation</w:t>
             </w:r>
           </w:p>
         </w:tc>
@@ -335,6 +455,84 @@
                 <w:sz w:val="20"/>
               </w:rPr>
               <w:t>Chat UI, citations, routing</w:t>
+            </w:r>
+          </w:p>
+        </w:tc>
+      </w:tr>
+      <w:tr>
+        <w:tc>
+          <w:tcPr>
+            <w:tcW w:type="dxa" w:w="4320"/>
+          </w:tcPr>
+          <w:p>
+            <w:r>
+              <w:rPr>
+                <w:sz w:val="20"/>
+              </w:rPr>
+            </w:r>
+            <w:r>
+              <w:rPr>
+                <w:rFonts w:ascii="Courier New" w:hAnsi="Courier New"/>
+                <w:sz w:val="20"/>
+              </w:rPr>
+              <w:t>app/ui/sidebar.py</w:t>
+            </w:r>
+          </w:p>
+        </w:tc>
+        <w:tc>
+          <w:tcPr>
+            <w:tcW w:type="dxa" w:w="4320"/>
+          </w:tcPr>
+          <w:p>
+            <w:r>
+              <w:rPr>
+                <w:sz w:val="20"/>
+              </w:rPr>
+            </w:r>
+            <w:r>
+              <w:rPr>
+                <w:sz w:val="20"/>
+              </w:rPr>
+              <w:t>Knowledge scope sidebar and Clear/Reset</w:t>
+            </w:r>
+          </w:p>
+        </w:tc>
+      </w:tr>
+      <w:tr>
+        <w:tc>
+          <w:tcPr>
+            <w:tcW w:type="dxa" w:w="4320"/>
+          </w:tcPr>
+          <w:p>
+            <w:r>
+              <w:rPr>
+                <w:sz w:val="20"/>
+              </w:rPr>
+            </w:r>
+            <w:r>
+              <w:rPr>
+                <w:rFonts w:ascii="Courier New" w:hAnsi="Courier New"/>
+                <w:sz w:val="20"/>
+              </w:rPr>
+              <w:t>app/ui/session.py</w:t>
+            </w:r>
+          </w:p>
+        </w:tc>
+        <w:tc>
+          <w:tcPr>
+            <w:tcW w:type="dxa" w:w="4320"/>
+          </w:tcPr>
+          <w:p>
+            <w:r>
+              <w:rPr>
+                <w:sz w:val="20"/>
+              </w:rPr>
+            </w:r>
+            <w:r>
+              <w:rPr>
+                <w:sz w:val="20"/>
+              </w:rPr>
+              <w:t>Session state and conversation history</w:t>
             </w:r>
           </w:p>
         </w:tc>
@@ -580,6 +778,48 @@
         <w:pStyle w:val="Heading1"/>
       </w:pPr>
       <w:r>
+        <w:t>User flow</w:t>
+      </w:r>
+    </w:p>
+    <w:p>
+      <w:pPr>
+        <w:pStyle w:val="ListNumber"/>
+      </w:pPr>
+      <w:r>
+        <w:rPr>
+          <w:b/>
+        </w:rPr>
+        <w:t>Welcome page</w:t>
+      </w:r>
+      <w:r>
+        <w:t xml:space="preserve"> — Project overview; user clicks </w:t>
+      </w:r>
+      <w:r>
+        <w:rPr>
+          <w:b/>
+        </w:rPr>
+        <w:t>Start Conversation</w:t>
+      </w:r>
+    </w:p>
+    <w:p>
+      <w:pPr>
+        <w:pStyle w:val="ListNumber"/>
+      </w:pPr>
+      <w:r>
+        <w:rPr>
+          <w:b/>
+        </w:rPr>
+        <w:t>Chat UI</w:t>
+      </w:r>
+      <w:r>
+        <w:t xml:space="preserve"> — Sidebar shows knowledge scope; user asks questions in the chat input</w:t>
+      </w:r>
+    </w:p>
+    <w:p>
+      <w:pPr>
+        <w:pStyle w:val="Heading1"/>
+      </w:pPr>
+      <w:r>
         <w:t>Query routing logic</w:t>
       </w:r>
     </w:p>
@@ -654,7 +894,9 @@
           <w:rFonts w:ascii="Courier New" w:hAnsi="Courier New"/>
           <w:sz w:val="18"/>
         </w:rPr>
-        <w:t>User Query</w:t>
+        <w:t>Welcome page → Start Conversation</w:t>
+        <w:br/>
+        <w:t xml:space="preserve">  → User query</w:t>
         <w:br/>
         <w:t xml:space="preserve">  → should_search_documents()</w:t>
         <w:br/>
@@ -670,7 +912,9 @@
         <w:br/>
         <w:t xml:space="preserve">  → get_source_list()</w:t>
         <w:br/>
-        <w:t xml:space="preserve">  → UI displays answer + sources</w:t>
+        <w:t xml:space="preserve">  → UI displays answer</w:t>
+        <w:br/>
+        <w:t xml:space="preserve">  → util/logger.py records full flow to logs/</w:t>
       </w:r>
     </w:p>
     <w:p/>
@@ -695,6 +939,9 @@
         <w:t>├── vector_store/       # ChromaDB (generated by ingest)</w:t>
         <w:br/>
         <w:t>└── bm25_index/         # BM25 pickle (generated by ingest)</w:t>
+        <w:br/>
+        <w:br/>
+        <w:t>logs/                   # Session log files (util/logger.py)</w:t>
       </w:r>
     </w:p>
     <w:p/>

</xml_diff>